<commit_message>
se creo el informe del proyecto
</commit_message>
<xml_diff>
--- a/cloudtasks-equipo13/docs/Informe_Final_CloudTasks_Equipo13.docx
+++ b/cloudtasks-equipo13/docs/Informe_Final_CloudTasks_Equipo13.docx
@@ -1007,6 +1007,22 @@
     </w:p>
     <w:p>
       <w:pPr>
+        <w:spacing w:after="160" w:line="276"/>
+        <w:jc w:val="both"/>
+      </w:pPr>
+      <w:r>
+        <w:rPr>
+          <w:rFonts w:ascii="Calibri" w:cs="Calibri" w:eastAsia="Calibri" w:hAnsi="Calibri"/>
+          <w:i w:val="false"/>
+          <w:iCs w:val="false"/>
+          <w:sz w:val="22"/>
+          <w:szCs w:val="22"/>
+        </w:rPr>
+        <w:t xml:space="preserve">El trabajo se organizó mediante ramas de feature por integración: por ejemplo, la conexión con Supabase se desarrolló y probó en la rama develop_supabaseIntegration antes de integrarse a develop y luego a main. El proyecto de Vercel quedó conectado directamente al repositorio, de modo que cada actualización relevante genera un nuevo despliegue; el panel de Vercel registra, por ejemplo, un despliegue a producción generado a partir del merge del pull request #6 (de la rama develop hacia main), lo que evidencia el uso de pull requests para integrar los cambios del equipo.</w:t>
+      </w:r>
+    </w:p>
+    <w:p>
+      <w:pPr>
         <w:spacing w:after="200" w:before="60"/>
         <w:jc w:val="both"/>
       </w:pPr>
@@ -1019,7 +1035,7 @@
           <w:sz w:val="20"/>
           <w:szCs w:val="20"/>
         </w:rPr>
-        <w:t xml:space="preserve">Nota: no se proporcionaron capturas de pantalla del repositorio, del historial de commits ni de pull requests; hace falta anexarlas para evidenciar el trabajo colaborativo en esta etapa.</w:t>
+        <w:t xml:space="preserve">Nota: no se proporcionó una captura del historial completo de commits ni del listado de pull requests del repositorio; solo se cuenta con la referencia al PR #6 visible en el panel de Vercel. Se recomienda anexar una captura de la pestaña “Pull requests” o “Commits” de GitHub.</w:t>
       </w:r>
     </w:p>
     <w:p>
@@ -1051,7 +1067,7 @@
           <w:sz w:val="22"/>
           <w:szCs w:val="22"/>
         </w:rPr>
-        <w:t xml:space="preserve">El proyecto se publicó inicialmente en Vercel bajo la URL genérica asignada por la plataforma, cloudtasks-equipo13.vercel.app. En la Etapa 3, con el dominio cloudtasks-equipo13.lat ya registrado en Namecheap, se ingresó a la sección Settings → Domains del proyecto en Vercel y se agregó dicho dominio, conectándolo al ambiente de Production en reemplazo de la URL genérica.</w:t>
+        <w:t xml:space="preserve">El proyecto de Vercel se creó desde la cuenta del integrante que aloja el repositorio en GitHub (Daniel Bautista), importando directamente el repositorio cloudtasks-equipo13 mediante la opción “Import Git Repository”. Durante la configuración se definió la carpeta raíz del proyecto (donde se encuentra index.html) para que Vercel pudiera identificar y desplegar correctamente el sitio estático.</w:t>
       </w:r>
     </w:p>
     <w:p>
@@ -1074,23 +1090,23 @@
           <w:sz w:val="20"/>
           <w:szCs w:val="20"/>
         </w:rPr>
-        <w:t xml:space="preserve">Aquí puede insertarse la Figura 7 del informe de la Etapa 3: “Adición del dominio personalizado en la configuración del proyecto en Vercel”.</w:t>
-      </w:r>
-    </w:p>
-    <w:p>
-      <w:pPr>
-        <w:spacing w:after="160" w:line="276"/>
-        <w:jc w:val="both"/>
-      </w:pPr>
-      <w:r>
-        <w:rPr>
-          <w:rFonts w:ascii="Calibri" w:cs="Calibri" w:eastAsia="Calibri" w:hAnsi="Calibri"/>
-          <w:i w:val="false"/>
-          <w:iCs w:val="false"/>
-          <w:sz w:val="22"/>
-          <w:szCs w:val="22"/>
-        </w:rPr>
-        <w:t xml:space="preserve">Al guardar, Vercel indicó que la configuración del dominio era inválida y proporcionó el registro DNS necesario para verificar su propiedad: un registro CNAME sobre el dominio raíz (@) apuntando a 2837a512d0512cb4.vercel-dns-017.com, con el proxy inicialmente desactivado.</w:t>
+        <w:t xml:space="preserve">Aquí puede insertarse la captura del informe de la Etapa 2: “Importación del repositorio cloudtasks-equipo13 de GitHub en un nuevo proyecto de Vercel”.</w:t>
+      </w:r>
+    </w:p>
+    <w:p>
+      <w:pPr>
+        <w:spacing w:after="160" w:line="276"/>
+        <w:jc w:val="both"/>
+      </w:pPr>
+      <w:r>
+        <w:rPr>
+          <w:rFonts w:ascii="Calibri" w:cs="Calibri" w:eastAsia="Calibri" w:hAnsi="Calibri"/>
+          <w:i w:val="false"/>
+          <w:iCs w:val="false"/>
+          <w:sz w:val="22"/>
+          <w:szCs w:val="22"/>
+        </w:rPr>
+        <w:t xml:space="preserve">Tras el primer despliegue exitoso, el proyecto quedó visible en el panel de Vercel con su Production Deployment activo, indicando el origen del despliegue (en el historial se registra, por ejemplo, un despliegue generado a partir del merge del pull request #6 desde la rama develop) y, más adelante, el dominio personalizado cloudtasks-equipo13.lat ya conectado.</w:t>
       </w:r>
     </w:p>
     <w:p>
@@ -1113,23 +1129,23 @@
           <w:sz w:val="20"/>
           <w:szCs w:val="20"/>
         </w:rPr>
-        <w:t xml:space="preserve">Aquí puede insertarse la Figura 8 del informe de la Etapa 3: “Registro CNAME requerido por Vercel para verificar y conectar el dominio”.</w:t>
-      </w:r>
-    </w:p>
-    <w:p>
-      <w:pPr>
-        <w:spacing w:after="160" w:line="276"/>
-        <w:jc w:val="both"/>
-      </w:pPr>
-      <w:r>
-        <w:rPr>
-          <w:rFonts w:ascii="Calibri" w:cs="Calibri" w:eastAsia="Calibri" w:hAnsi="Calibri"/>
-          <w:i w:val="false"/>
-          <w:iCs w:val="false"/>
-          <w:sz w:val="22"/>
-          <w:szCs w:val="22"/>
-        </w:rPr>
-        <w:t xml:space="preserve">Una vez creado ese registro en Cloudflare (ver sección 9), Vercel detectó la conexión y comenzó a emitir el certificado SSL/TLS del dominio personalizado (“Generating SSL Certificate”), confirmando que el dominio resolvía correctamente hacia Vercel.</w:t>
+        <w:t xml:space="preserve">Aquí puede insertarse la captura del informe de la Etapa 2: “Overview del proyecto en Vercel tras el despliegue en producción, con el dominio cloudtasks-equipo13.lat conectado”.</w:t>
+      </w:r>
+    </w:p>
+    <w:p>
+      <w:pPr>
+        <w:spacing w:after="160" w:line="276"/>
+        <w:jc w:val="both"/>
+      </w:pPr>
+      <w:r>
+        <w:rPr>
+          <w:rFonts w:ascii="Calibri" w:cs="Calibri" w:eastAsia="Calibri" w:hAnsi="Calibri"/>
+          <w:i w:val="false"/>
+          <w:iCs w:val="false"/>
+          <w:sz w:val="22"/>
+          <w:szCs w:val="22"/>
+        </w:rPr>
+        <w:t xml:space="preserve">El proyecto se publicó inicialmente bajo una URL genérica asignada por la plataforma (del tipo cloudtasks-equipo13-*.vercel.app). En la Etapa 3, con el dominio cloudtasks-equipo13.lat ya registrado en Namecheap, se ingresó a la sección Settings → Domains del proyecto en Vercel y se agregó dicho dominio, conectándolo al ambiente de Production en reemplazo de la URL genérica.</w:t>
       </w:r>
     </w:p>
     <w:p>
@@ -1152,6 +1168,84 @@
           <w:sz w:val="20"/>
           <w:szCs w:val="20"/>
         </w:rPr>
+        <w:t xml:space="preserve">Aquí puede insertarse la Figura 7 del informe de la Etapa 3: “Adición del dominio personalizado en la configuración del proyecto en Vercel”.</w:t>
+      </w:r>
+    </w:p>
+    <w:p>
+      <w:pPr>
+        <w:spacing w:after="160" w:line="276"/>
+        <w:jc w:val="both"/>
+      </w:pPr>
+      <w:r>
+        <w:rPr>
+          <w:rFonts w:ascii="Calibri" w:cs="Calibri" w:eastAsia="Calibri" w:hAnsi="Calibri"/>
+          <w:i w:val="false"/>
+          <w:iCs w:val="false"/>
+          <w:sz w:val="22"/>
+          <w:szCs w:val="22"/>
+        </w:rPr>
+        <w:t xml:space="preserve">Al guardar, Vercel indicó que la configuración del dominio era inválida y proporcionó el registro DNS necesario para verificar su propiedad: un registro CNAME sobre el dominio raíz (@) apuntando a 2837a512d0512cb4.vercel-dns-017.com, con el proxy inicialmente desactivado.</w:t>
+      </w:r>
+    </w:p>
+    <w:p>
+      <w:pPr>
+        <w:pBdr>
+          <w:top w:val="single" w:color="AAAAAA" w:sz="4"/>
+          <w:bottom w:val="single" w:color="AAAAAA" w:sz="4"/>
+          <w:left w:val="single" w:color="AAAAAA" w:sz="4"/>
+          <w:right w:val="single" w:color="AAAAAA" w:sz="4"/>
+        </w:pBdr>
+        <w:spacing w:after="200" w:before="120"/>
+        <w:jc w:val="center"/>
+      </w:pPr>
+      <w:r>
+        <w:rPr>
+          <w:rFonts w:ascii="Calibri" w:cs="Calibri" w:eastAsia="Calibri" w:hAnsi="Calibri"/>
+          <w:i/>
+          <w:iCs/>
+          <w:color w:val="555555"/>
+          <w:sz w:val="20"/>
+          <w:szCs w:val="20"/>
+        </w:rPr>
+        <w:t xml:space="preserve">Aquí puede insertarse la Figura 8 del informe de la Etapa 3: “Registro CNAME requerido por Vercel para verificar y conectar el dominio”.</w:t>
+      </w:r>
+    </w:p>
+    <w:p>
+      <w:pPr>
+        <w:spacing w:after="160" w:line="276"/>
+        <w:jc w:val="both"/>
+      </w:pPr>
+      <w:r>
+        <w:rPr>
+          <w:rFonts w:ascii="Calibri" w:cs="Calibri" w:eastAsia="Calibri" w:hAnsi="Calibri"/>
+          <w:i w:val="false"/>
+          <w:iCs w:val="false"/>
+          <w:sz w:val="22"/>
+          <w:szCs w:val="22"/>
+        </w:rPr>
+        <w:t xml:space="preserve">Una vez creado ese registro en Cloudflare (ver sección 9), Vercel detectó la conexión y comenzó a emitir el certificado SSL/TLS del dominio personalizado (“Generating SSL Certificate”), confirmando que el dominio resolvía correctamente hacia Vercel.</w:t>
+      </w:r>
+    </w:p>
+    <w:p>
+      <w:pPr>
+        <w:pBdr>
+          <w:top w:val="single" w:color="AAAAAA" w:sz="4"/>
+          <w:bottom w:val="single" w:color="AAAAAA" w:sz="4"/>
+          <w:left w:val="single" w:color="AAAAAA" w:sz="4"/>
+          <w:right w:val="single" w:color="AAAAAA" w:sz="4"/>
+        </w:pBdr>
+        <w:spacing w:after="200" w:before="120"/>
+        <w:jc w:val="center"/>
+      </w:pPr>
+      <w:r>
+        <w:rPr>
+          <w:rFonts w:ascii="Calibri" w:cs="Calibri" w:eastAsia="Calibri" w:hAnsi="Calibri"/>
+          <w:i/>
+          <w:iCs/>
+          <w:color w:val="555555"/>
+          <w:sz w:val="20"/>
+          <w:szCs w:val="20"/>
+        </w:rPr>
         <w:t xml:space="preserve">Aquí puede insertarse la Figura 11 del informe de la Etapa 3: “Vercel generando el certificado SSL para el dominio personalizado”.</w:t>
       </w:r>
     </w:p>
@@ -1200,23 +1294,177 @@
           <w:sz w:val="22"/>
           <w:szCs w:val="22"/>
         </w:rPr>
-        <w:t xml:space="preserve">La persistencia de datos de CloudTasks se implementó sobre un proyecto de Supabase (URL del proyecto: rnaaxyenpllnzmpokrcp.supabase.co), con una tabla tasks en PostgreSQL que almacena, por cada tarea, su título, descripción, prioridad, fecha límite, estado de completado y fecha de creación.</w:t>
-      </w:r>
-    </w:p>
-    <w:p>
-      <w:pPr>
-        <w:spacing w:after="160" w:line="276"/>
-        <w:jc w:val="both"/>
-      </w:pPr>
-      <w:r>
-        <w:rPr>
-          <w:rFonts w:ascii="Calibri" w:cs="Calibri" w:eastAsia="Calibri" w:hAnsi="Calibri"/>
-          <w:i w:val="false"/>
-          <w:iCs w:val="false"/>
-          <w:sz w:val="22"/>
-          <w:szCs w:val="22"/>
-        </w:rPr>
-        <w:t xml:space="preserve">La conexión desde el frontend se realiza mediante el cliente oficial supabase-js v2, referenciado en index.html desde el CDN de jsDelivr e inicializado en js/supabaseClient.js con la URL del proyecto y la llave pública (anon key). A partir de ese cliente, js/app.js implementa las cuatro operaciones sobre la tabla tasks:</w:t>
+        <w:t xml:space="preserve">La persistencia de datos de CloudTasks se implementó sobre un proyecto de Supabase (URL del proyecto: rnaaxyenpllnzmpokrcp.supabase.co), creado en la cuenta del integrante Jhoan Esteban Delgado. La tabla tasks se creó manualmente desde el Editor SQL de Supabase, con la siguiente definición:</w:t>
+      </w:r>
+    </w:p>
+    <w:p>
+      <w:pPr>
+        <w:pBdr>
+          <w:top w:val="single" w:color="CCCCCC" w:sz="2"/>
+          <w:bottom w:val="single" w:color="CCCCCC" w:sz="2"/>
+          <w:left w:val="single" w:color="CCCCCC" w:sz="2"/>
+          <w:right w:val="single" w:color="CCCCCC" w:sz="2"/>
+        </w:pBdr>
+        <w:shd w:fill="F2F2F2"/>
+        <w:spacing w:after="200" w:before="100"/>
+      </w:pPr>
+      <w:r>
+        <w:rPr>
+          <w:rFonts w:ascii="Consolas" w:cs="Consolas" w:eastAsia="Consolas" w:hAnsi="Consolas"/>
+          <w:sz w:val="18"/>
+          <w:szCs w:val="18"/>
+        </w:rPr>
+        <w:t xml:space="preserve">CREATE TABLE tasks (</w:t>
+      </w:r>
+      <w:r>
+        <w:rPr>
+          <w:rFonts w:ascii="Consolas" w:cs="Consolas" w:eastAsia="Consolas" w:hAnsi="Consolas"/>
+          <w:sz w:val="18"/>
+          <w:szCs w:val="18"/>
+        </w:rPr>
+        <w:br/>
+        <w:t xml:space="preserve">  id BIGINT GENERATED BY DEFAULT AS IDENTITY PRIMARY KEY,</w:t>
+      </w:r>
+      <w:r>
+        <w:rPr>
+          <w:rFonts w:ascii="Consolas" w:cs="Consolas" w:eastAsia="Consolas" w:hAnsi="Consolas"/>
+          <w:sz w:val="18"/>
+          <w:szCs w:val="18"/>
+        </w:rPr>
+        <w:br/>
+        <w:t xml:space="preserve">  title TEXT NOT NULL,</w:t>
+      </w:r>
+      <w:r>
+        <w:rPr>
+          <w:rFonts w:ascii="Consolas" w:cs="Consolas" w:eastAsia="Consolas" w:hAnsi="Consolas"/>
+          <w:sz w:val="18"/>
+          <w:szCs w:val="18"/>
+        </w:rPr>
+        <w:br/>
+        <w:t xml:space="preserve">  description TEXT NOT NULL,</w:t>
+      </w:r>
+      <w:r>
+        <w:rPr>
+          <w:rFonts w:ascii="Consolas" w:cs="Consolas" w:eastAsia="Consolas" w:hAnsi="Consolas"/>
+          <w:sz w:val="18"/>
+          <w:szCs w:val="18"/>
+        </w:rPr>
+        <w:br/>
+        <w:t xml:space="preserve">  completed BOOLEAN NOT NULL DEFAULT FALSE,</w:t>
+      </w:r>
+      <w:r>
+        <w:rPr>
+          <w:rFonts w:ascii="Consolas" w:cs="Consolas" w:eastAsia="Consolas" w:hAnsi="Consolas"/>
+          <w:sz w:val="18"/>
+          <w:szCs w:val="18"/>
+        </w:rPr>
+        <w:br/>
+        <w:t xml:space="preserve">  created_at TIMESTAMPTZ NOT NULL DEFAULT NOW(),</w:t>
+      </w:r>
+      <w:r>
+        <w:rPr>
+          <w:rFonts w:ascii="Consolas" w:cs="Consolas" w:eastAsia="Consolas" w:hAnsi="Consolas"/>
+          <w:sz w:val="18"/>
+          <w:szCs w:val="18"/>
+        </w:rPr>
+        <w:br/>
+        <w:t xml:space="preserve">  deadline DATE NOT NULL,</w:t>
+      </w:r>
+      <w:r>
+        <w:rPr>
+          <w:rFonts w:ascii="Consolas" w:cs="Consolas" w:eastAsia="Consolas" w:hAnsi="Consolas"/>
+          <w:sz w:val="18"/>
+          <w:szCs w:val="18"/>
+        </w:rPr>
+        <w:br/>
+        <w:t xml:space="preserve">  priority TEXT NOT NULL</w:t>
+      </w:r>
+      <w:r>
+        <w:rPr>
+          <w:rFonts w:ascii="Consolas" w:cs="Consolas" w:eastAsia="Consolas" w:hAnsi="Consolas"/>
+          <w:sz w:val="18"/>
+          <w:szCs w:val="18"/>
+        </w:rPr>
+        <w:br/>
+        <w:t xml:space="preserve">);</w:t>
+      </w:r>
+    </w:p>
+    <w:p>
+      <w:pPr>
+        <w:pBdr>
+          <w:top w:val="single" w:color="AAAAAA" w:sz="4"/>
+          <w:bottom w:val="single" w:color="AAAAAA" w:sz="4"/>
+          <w:left w:val="single" w:color="AAAAAA" w:sz="4"/>
+          <w:right w:val="single" w:color="AAAAAA" w:sz="4"/>
+        </w:pBdr>
+        <w:spacing w:after="200" w:before="120"/>
+        <w:jc w:val="center"/>
+      </w:pPr>
+      <w:r>
+        <w:rPr>
+          <w:rFonts w:ascii="Calibri" w:cs="Calibri" w:eastAsia="Calibri" w:hAnsi="Calibri"/>
+          <w:i/>
+          <w:iCs/>
+          <w:color w:val="555555"/>
+          <w:sz w:val="20"/>
+          <w:szCs w:val="20"/>
+        </w:rPr>
+        <w:t xml:space="preserve">Aquí puede insertarse la captura del informe de la Etapa 2: “Creación de la tabla tasks mediante el editor SQL de Supabase”.</w:t>
+      </w:r>
+    </w:p>
+    <w:p>
+      <w:pPr>
+        <w:spacing w:after="160" w:line="276"/>
+        <w:jc w:val="both"/>
+      </w:pPr>
+      <w:r>
+        <w:rPr>
+          <w:rFonts w:ascii="Calibri" w:cs="Calibri" w:eastAsia="Calibri" w:hAnsi="Calibri"/>
+          <w:i w:val="false"/>
+          <w:iCs w:val="false"/>
+          <w:sz w:val="22"/>
+          <w:szCs w:val="22"/>
+        </w:rPr>
+        <w:t xml:space="preserve">Para verificar la tabla se insertaron registros de prueba mediante sentencias INSERT (por ejemplo, “Estudiar redes”, “Hacer laboratorio” y “Estudiar cálculo”, cada uno con su descripción, fecha límite y prioridad) y se confirmó su creación consultando SELECT * FROM tasks, obteniendo los tres registros esperados.</w:t>
+      </w:r>
+    </w:p>
+    <w:p>
+      <w:pPr>
+        <w:pBdr>
+          <w:top w:val="single" w:color="AAAAAA" w:sz="4"/>
+          <w:bottom w:val="single" w:color="AAAAAA" w:sz="4"/>
+          <w:left w:val="single" w:color="AAAAAA" w:sz="4"/>
+          <w:right w:val="single" w:color="AAAAAA" w:sz="4"/>
+        </w:pBdr>
+        <w:spacing w:after="200" w:before="120"/>
+        <w:jc w:val="center"/>
+      </w:pPr>
+      <w:r>
+        <w:rPr>
+          <w:rFonts w:ascii="Calibri" w:cs="Calibri" w:eastAsia="Calibri" w:hAnsi="Calibri"/>
+          <w:i/>
+          <w:iCs/>
+          <w:color w:val="555555"/>
+          <w:sz w:val="20"/>
+          <w:szCs w:val="20"/>
+        </w:rPr>
+        <w:t xml:space="preserve">Aquí puede insertarse la captura del informe de la Etapa 2: “Inserción y consulta de registros de prueba en la tabla tasks (resultado de SELECT * FROM tasks)”.</w:t>
+      </w:r>
+    </w:p>
+    <w:p>
+      <w:pPr>
+        <w:spacing w:after="160" w:line="276"/>
+        <w:jc w:val="both"/>
+      </w:pPr>
+      <w:r>
+        <w:rPr>
+          <w:rFonts w:ascii="Calibri" w:cs="Calibri" w:eastAsia="Calibri" w:hAnsi="Calibri"/>
+          <w:i w:val="false"/>
+          <w:iCs w:val="false"/>
+          <w:sz w:val="22"/>
+          <w:szCs w:val="22"/>
+        </w:rPr>
+        <w:t xml:space="preserve">La conexión desde el frontend se realiza mediante el cliente oficial supabase-js v2, referenciado en index.html desde el CDN de jsDelivr e inicializado en js/supabaseClient.js con la URL del proyecto y la llave pública (anon key: sb_publishable_5hAfdGVhkNDZmm1vtN7UWQ_KT4Pt2Z5). A partir de ese cliente, js/app.js implementa las cuatro operaciones sobre la tabla tasks:</w:t>
       </w:r>
     </w:p>
     <w:p>
@@ -1308,7 +1556,231 @@
           <w:sz w:val="22"/>
           <w:szCs w:val="22"/>
         </w:rPr>
-        <w:t xml:space="preserve">La interfaz contempla explícitamente el caso de fallo de conexión: si la consulta a Supabase falla, se muestra un mensaje fijo en la aplicación indicando que debe revisarse la URL y la anon key configuradas en supabaseClient.js, así como que las políticas de RLS (Row Level Security) de la tabla tasks permitan el acceso al rol anon. Esto evidencia que, además de crear la tabla, el equipo debió configurar los permisos de lectura y escritura pública controlados por RLS para que la aplicación pudiera operar sin autenticación de usuario.</w:t>
+        <w:t xml:space="preserve">Al crear la tabla, Supabase advirtió que debía habilitarse Row Level Security (RLS) para protegerla de accesos no controlados. Como CloudTasks no maneja usuarios ni autenticación, el equipo optó por crear cuatro políticas que permiten las operaciones CRUD al rol público anon:</w:t>
+      </w:r>
+    </w:p>
+    <w:p>
+      <w:pPr>
+        <w:pBdr>
+          <w:top w:val="single" w:color="CCCCCC" w:sz="2"/>
+          <w:bottom w:val="single" w:color="CCCCCC" w:sz="2"/>
+          <w:left w:val="single" w:color="CCCCCC" w:sz="2"/>
+          <w:right w:val="single" w:color="CCCCCC" w:sz="2"/>
+        </w:pBdr>
+        <w:shd w:fill="F2F2F2"/>
+        <w:spacing w:after="200" w:before="100"/>
+      </w:pPr>
+      <w:r>
+        <w:rPr>
+          <w:rFonts w:ascii="Consolas" w:cs="Consolas" w:eastAsia="Consolas" w:hAnsi="Consolas"/>
+          <w:sz w:val="18"/>
+          <w:szCs w:val="18"/>
+        </w:rPr>
+        <w:t xml:space="preserve">CREATE POLICY "Permitir consultar tareas"</w:t>
+      </w:r>
+      <w:r>
+        <w:rPr>
+          <w:rFonts w:ascii="Consolas" w:cs="Consolas" w:eastAsia="Consolas" w:hAnsi="Consolas"/>
+          <w:sz w:val="18"/>
+          <w:szCs w:val="18"/>
+        </w:rPr>
+        <w:br/>
+        <w:t xml:space="preserve">ON public.tasks FOR SELECT TO anon</w:t>
+      </w:r>
+      <w:r>
+        <w:rPr>
+          <w:rFonts w:ascii="Consolas" w:cs="Consolas" w:eastAsia="Consolas" w:hAnsi="Consolas"/>
+          <w:sz w:val="18"/>
+          <w:szCs w:val="18"/>
+        </w:rPr>
+        <w:br/>
+        <w:t xml:space="preserve">USING (true);</w:t>
+      </w:r>
+      <w:r>
+        <w:rPr>
+          <w:rFonts w:ascii="Consolas" w:cs="Consolas" w:eastAsia="Consolas" w:hAnsi="Consolas"/>
+          <w:sz w:val="18"/>
+          <w:szCs w:val="18"/>
+        </w:rPr>
+        <w:br/>
+        <w:t xml:space="preserve"> </w:t>
+      </w:r>
+      <w:r>
+        <w:rPr>
+          <w:rFonts w:ascii="Consolas" w:cs="Consolas" w:eastAsia="Consolas" w:hAnsi="Consolas"/>
+          <w:sz w:val="18"/>
+          <w:szCs w:val="18"/>
+        </w:rPr>
+        <w:br/>
+        <w:t xml:space="preserve">CREATE POLICY "Permitir crear tareas"</w:t>
+      </w:r>
+      <w:r>
+        <w:rPr>
+          <w:rFonts w:ascii="Consolas" w:cs="Consolas" w:eastAsia="Consolas" w:hAnsi="Consolas"/>
+          <w:sz w:val="18"/>
+          <w:szCs w:val="18"/>
+        </w:rPr>
+        <w:br/>
+        <w:t xml:space="preserve">ON public.tasks FOR INSERT TO anon</w:t>
+      </w:r>
+      <w:r>
+        <w:rPr>
+          <w:rFonts w:ascii="Consolas" w:cs="Consolas" w:eastAsia="Consolas" w:hAnsi="Consolas"/>
+          <w:sz w:val="18"/>
+          <w:szCs w:val="18"/>
+        </w:rPr>
+        <w:br/>
+        <w:t xml:space="preserve">WITH CHECK (true);</w:t>
+      </w:r>
+      <w:r>
+        <w:rPr>
+          <w:rFonts w:ascii="Consolas" w:cs="Consolas" w:eastAsia="Consolas" w:hAnsi="Consolas"/>
+          <w:sz w:val="18"/>
+          <w:szCs w:val="18"/>
+        </w:rPr>
+        <w:br/>
+        <w:t xml:space="preserve"> </w:t>
+      </w:r>
+      <w:r>
+        <w:rPr>
+          <w:rFonts w:ascii="Consolas" w:cs="Consolas" w:eastAsia="Consolas" w:hAnsi="Consolas"/>
+          <w:sz w:val="18"/>
+          <w:szCs w:val="18"/>
+        </w:rPr>
+        <w:br/>
+        <w:t xml:space="preserve">CREATE POLICY "Permitir actualizar tareas"</w:t>
+      </w:r>
+      <w:r>
+        <w:rPr>
+          <w:rFonts w:ascii="Consolas" w:cs="Consolas" w:eastAsia="Consolas" w:hAnsi="Consolas"/>
+          <w:sz w:val="18"/>
+          <w:szCs w:val="18"/>
+        </w:rPr>
+        <w:br/>
+        <w:t xml:space="preserve">ON public.tasks FOR UPDATE TO anon</w:t>
+      </w:r>
+      <w:r>
+        <w:rPr>
+          <w:rFonts w:ascii="Consolas" w:cs="Consolas" w:eastAsia="Consolas" w:hAnsi="Consolas"/>
+          <w:sz w:val="18"/>
+          <w:szCs w:val="18"/>
+        </w:rPr>
+        <w:br/>
+        <w:t xml:space="preserve">USING (true) WITH CHECK (true);</w:t>
+      </w:r>
+      <w:r>
+        <w:rPr>
+          <w:rFonts w:ascii="Consolas" w:cs="Consolas" w:eastAsia="Consolas" w:hAnsi="Consolas"/>
+          <w:sz w:val="18"/>
+          <w:szCs w:val="18"/>
+        </w:rPr>
+        <w:br/>
+        <w:t xml:space="preserve"> </w:t>
+      </w:r>
+      <w:r>
+        <w:rPr>
+          <w:rFonts w:ascii="Consolas" w:cs="Consolas" w:eastAsia="Consolas" w:hAnsi="Consolas"/>
+          <w:sz w:val="18"/>
+          <w:szCs w:val="18"/>
+        </w:rPr>
+        <w:br/>
+        <w:t xml:space="preserve">CREATE POLICY "Permitir eliminar tareas"</w:t>
+      </w:r>
+      <w:r>
+        <w:rPr>
+          <w:rFonts w:ascii="Consolas" w:cs="Consolas" w:eastAsia="Consolas" w:hAnsi="Consolas"/>
+          <w:sz w:val="18"/>
+          <w:szCs w:val="18"/>
+        </w:rPr>
+        <w:br/>
+        <w:t xml:space="preserve">ON public.tasks FOR DELETE TO anon</w:t>
+      </w:r>
+      <w:r>
+        <w:rPr>
+          <w:rFonts w:ascii="Consolas" w:cs="Consolas" w:eastAsia="Consolas" w:hAnsi="Consolas"/>
+          <w:sz w:val="18"/>
+          <w:szCs w:val="18"/>
+        </w:rPr>
+        <w:br/>
+        <w:t xml:space="preserve">USING (true);</w:t>
+      </w:r>
+    </w:p>
+    <w:p>
+      <w:pPr>
+        <w:pBdr>
+          <w:top w:val="single" w:color="AAAAAA" w:sz="4"/>
+          <w:bottom w:val="single" w:color="AAAAAA" w:sz="4"/>
+          <w:left w:val="single" w:color="AAAAAA" w:sz="4"/>
+          <w:right w:val="single" w:color="AAAAAA" w:sz="4"/>
+        </w:pBdr>
+        <w:spacing w:after="200" w:before="120"/>
+        <w:jc w:val="center"/>
+      </w:pPr>
+      <w:r>
+        <w:rPr>
+          <w:rFonts w:ascii="Calibri" w:cs="Calibri" w:eastAsia="Calibri" w:hAnsi="Calibri"/>
+          <w:i/>
+          <w:iCs/>
+          <w:color w:val="555555"/>
+          <w:sz w:val="20"/>
+          <w:szCs w:val="20"/>
+        </w:rPr>
+        <w:t xml:space="preserve">Aquí puede insertarse la captura del informe de la Etapa 2: “Panel de políticas RLS configuradas sobre la tabla tasks (Database → Policies)”.</w:t>
+      </w:r>
+    </w:p>
+    <w:p>
+      <w:pPr>
+        <w:spacing w:after="160" w:line="276"/>
+        <w:jc w:val="both"/>
+      </w:pPr>
+      <w:r>
+        <w:rPr>
+          <w:rFonts w:ascii="Calibri" w:cs="Calibri" w:eastAsia="Calibri" w:hAnsi="Calibri"/>
+          <w:i w:val="false"/>
+          <w:iCs w:val="false"/>
+          <w:sz w:val="22"/>
+          <w:szCs w:val="22"/>
+        </w:rPr>
+        <w:t xml:space="preserve">La interfaz contempla explícitamente el caso de fallo de conexión: si la consulta a Supabase falla, se muestra un mensaje fijo en la aplicación indicando que debe revisarse la URL y la anon key configuradas en supabaseClient.js, así como que las políticas de RLS descritas arriba permitan el acceso al rol anon.</w:t>
+      </w:r>
+    </w:p>
+    <w:p>
+      <w:pPr>
+        <w:spacing w:after="160" w:line="276"/>
+        <w:jc w:val="both"/>
+      </w:pPr>
+      <w:r>
+        <w:rPr>
+          <w:rFonts w:ascii="Calibri" w:cs="Calibri" w:eastAsia="Calibri" w:hAnsi="Calibri"/>
+          <w:i w:val="false"/>
+          <w:iCs w:val="false"/>
+          <w:sz w:val="22"/>
+          <w:szCs w:val="22"/>
+        </w:rPr>
+        <w:t xml:space="preserve">Antes de integrar la aplicación con Vercel, esta conexión se probó ejecutando CloudTasks de forma local: la interfaz cargó correctamente las tareas de prueba y la consola del navegador confirmó la conexión exitosa a Supabase, reportando la cantidad de registros obtenidos.</w:t>
+      </w:r>
+    </w:p>
+    <w:p>
+      <w:pPr>
+        <w:pBdr>
+          <w:top w:val="single" w:color="AAAAAA" w:sz="4"/>
+          <w:bottom w:val="single" w:color="AAAAAA" w:sz="4"/>
+          <w:left w:val="single" w:color="AAAAAA" w:sz="4"/>
+          <w:right w:val="single" w:color="AAAAAA" w:sz="4"/>
+        </w:pBdr>
+        <w:spacing w:after="200" w:before="120"/>
+        <w:jc w:val="center"/>
+      </w:pPr>
+      <w:r>
+        <w:rPr>
+          <w:rFonts w:ascii="Calibri" w:cs="Calibri" w:eastAsia="Calibri" w:hAnsi="Calibri"/>
+          <w:i/>
+          <w:iCs/>
+          <w:color w:val="555555"/>
+          <w:sz w:val="20"/>
+          <w:szCs w:val="20"/>
+        </w:rPr>
+        <w:t xml:space="preserve">Aquí puede insertarse la captura del informe de la Etapa 2: “Prueba local de la interfaz de CloudTasks cargando tareas y consola del navegador confirmando la conexión exitosa a Supabase”.</w:t>
       </w:r>
     </w:p>
     <w:p>
@@ -1325,7 +1797,7 @@
           <w:sz w:val="20"/>
           <w:szCs w:val="20"/>
         </w:rPr>
-        <w:t xml:space="preserve">Nota: no se incluyeron capturas de pantalla del panel de Supabase (tabla tasks, editor SQL o configuración de políticas RLS); hace falta anexarlas para documentar esta integración.</w:t>
+        <w:t xml:space="preserve">Nota: no se incluyeron capturas del Table Editor de Supabase (vista de tabla tipo hoja de cálculo); solo se cuenta con las del editor SQL y del panel de políticas. Puede anexarse si se dispone de ella.</w:t>
       </w:r>
     </w:p>
     <w:p>

</xml_diff>